<commit_message>
Conversor: listas com marcador e numeradas como no modelo do escritório
O .docx modelo formata os blocos de itens (dados da CTPS, CCTs, documentos a
exibir, agentes insalubres etc.) como lista com marcador e os requerimentos
finais como lista numerada. O conversor agora reproduz essa configuração:

- "- item" vira marcador (bullet Symbol) e "1. item" vira lista numerada;
- recuo à esquerda de 720 twips e deslocamento de 360, iguais ao modelo,
  vindos da definição da lista (sem w:ind no parágrafo);
- cada bloco ganha a sua própria definição, de modo que as listas numeradas
  recomeçam em 1;
- itens seguem justificados, em Times New Roman 12 e entrelinha 1,5.

Aplicado à inicial do Jackson: 12 blocos com marcador e os requerimentos
finais numerados, com o mesmo padrão de espaçamento do modelo.

Co-Authored-By: Claude Opus 5 <noreply@anthropic.com>
Claude-Session: https://claude.ai/code/session_018MPh84zb3KcahKLkQRn5Qf
</commit_message>
<xml_diff>
--- a/pecas/JACKSON EVANDRO STREIT/JACKSON EVANDRO STREIT - RECLAMAÇÃO.docx
+++ b/pecas/JACKSON EVANDRO STREIT/JACKSON EVANDRO STREIT - RECLAMAÇÃO.docx
@@ -336,7 +336,10 @@
     <w:p/>
     <w:p>
       <w:pPr>
-        <w:ind w:firstLine="850"/>
+        <w:numPr>
+          <w:ilvl w:val="0"/>
+          <w:numId w:val="10"/>
+        </w:numPr>
         <w:jc w:val="both"/>
       </w:pPr>
       <w:r>
@@ -349,10 +352,12 @@
         <w:t>admissão: 02/10/2024;</w:t>
       </w:r>
     </w:p>
-    <w:p/>
     <w:p>
       <w:pPr>
-        <w:ind w:firstLine="850"/>
+        <w:numPr>
+          <w:ilvl w:val="0"/>
+          <w:numId w:val="10"/>
+        </w:numPr>
         <w:jc w:val="both"/>
       </w:pPr>
       <w:r>
@@ -365,10 +370,12 @@
         <w:t>término do contrato: 22/09/2025;</w:t>
       </w:r>
     </w:p>
-    <w:p/>
     <w:p>
       <w:pPr>
-        <w:ind w:firstLine="850"/>
+        <w:numPr>
+          <w:ilvl w:val="0"/>
+          <w:numId w:val="10"/>
+        </w:numPr>
         <w:jc w:val="both"/>
       </w:pPr>
       <w:r>
@@ -381,10 +388,12 @@
         <w:t>projeção do aviso-prévio indenizado: 25/10/2025;</w:t>
       </w:r>
     </w:p>
-    <w:p/>
     <w:p>
       <w:pPr>
-        <w:ind w:firstLine="850"/>
+        <w:numPr>
+          <w:ilvl w:val="0"/>
+          <w:numId w:val="10"/>
+        </w:numPr>
         <w:jc w:val="both"/>
       </w:pPr>
       <w:r>
@@ -397,10 +406,12 @@
         <w:t>cargo: trabalhador polivalente injeção de EVA;</w:t>
       </w:r>
     </w:p>
-    <w:p/>
     <w:p>
       <w:pPr>
-        <w:ind w:firstLine="850"/>
+        <w:numPr>
+          <w:ilvl w:val="0"/>
+          <w:numId w:val="10"/>
+        </w:numPr>
         <w:jc w:val="both"/>
       </w:pPr>
       <w:r>
@@ -413,10 +424,12 @@
         <w:t>código CBO do cargo: 8117-70;</w:t>
       </w:r>
     </w:p>
-    <w:p/>
     <w:p>
       <w:pPr>
-        <w:ind w:firstLine="850"/>
+        <w:numPr>
+          <w:ilvl w:val="0"/>
+          <w:numId w:val="10"/>
+        </w:numPr>
         <w:jc w:val="both"/>
       </w:pPr>
       <w:r>
@@ -429,10 +442,12 @@
         <w:t>salário inicial: R$ 9,94 por hora;</w:t>
       </w:r>
     </w:p>
-    <w:p/>
     <w:p>
       <w:pPr>
-        <w:ind w:firstLine="850"/>
+        <w:numPr>
+          <w:ilvl w:val="0"/>
+          <w:numId w:val="10"/>
+        </w:numPr>
         <w:jc w:val="both"/>
       </w:pPr>
       <w:r>
@@ -445,10 +460,12 @@
         <w:t>salário a partir de 01/05/2025: R$ 11,94 por hora;</w:t>
       </w:r>
     </w:p>
-    <w:p/>
     <w:p>
       <w:pPr>
-        <w:ind w:firstLine="850"/>
+        <w:numPr>
+          <w:ilvl w:val="0"/>
+          <w:numId w:val="10"/>
+        </w:numPr>
         <w:jc w:val="both"/>
       </w:pPr>
       <w:r>
@@ -461,10 +478,12 @@
         <w:t>contrato inicialmente registrado por prazo determinado, com término previsto para 31/10/2024, anotado como contrato por prazo indeterminado a partir de 01/05/2025;</w:t>
       </w:r>
     </w:p>
-    <w:p/>
     <w:p>
       <w:pPr>
-        <w:ind w:firstLine="850"/>
+        <w:numPr>
+          <w:ilvl w:val="0"/>
+          <w:numId w:val="10"/>
+        </w:numPr>
         <w:jc w:val="both"/>
       </w:pPr>
       <w:r>
@@ -627,7 +646,10 @@
     <w:p/>
     <w:p>
       <w:pPr>
-        <w:ind w:firstLine="850"/>
+        <w:numPr>
+          <w:ilvl w:val="0"/>
+          <w:numId w:val="11"/>
+        </w:numPr>
         <w:jc w:val="both"/>
       </w:pPr>
       <w:r>
@@ -640,10 +662,12 @@
         <w:t>CCT 2024/2025 – registro MTE nº RS003113/2024;</w:t>
       </w:r>
     </w:p>
-    <w:p/>
     <w:p>
       <w:pPr>
-        <w:ind w:firstLine="850"/>
+        <w:numPr>
+          <w:ilvl w:val="0"/>
+          <w:numId w:val="11"/>
+        </w:numPr>
         <w:jc w:val="both"/>
       </w:pPr>
       <w:r>
@@ -692,7 +716,10 @@
     <w:p/>
     <w:p>
       <w:pPr>
-        <w:ind w:firstLine="850"/>
+        <w:numPr>
+          <w:ilvl w:val="0"/>
+          <w:numId w:val="12"/>
+        </w:numPr>
         <w:jc w:val="both"/>
       </w:pPr>
       <w:r>
@@ -705,10 +732,12 @@
         <w:t>adicional de 60% sobre as horas extraordinárias;</w:t>
       </w:r>
     </w:p>
-    <w:p/>
     <w:p>
       <w:pPr>
-        <w:ind w:firstLine="850"/>
+        <w:numPr>
+          <w:ilvl w:val="0"/>
+          <w:numId w:val="12"/>
+        </w:numPr>
         <w:jc w:val="both"/>
       </w:pPr>
       <w:r>
@@ -721,10 +750,12 @@
         <w:t>pagamento em dobro dos domingos e feriados não compensados;</w:t>
       </w:r>
     </w:p>
-    <w:p/>
     <w:p>
       <w:pPr>
-        <w:ind w:firstLine="850"/>
+        <w:numPr>
+          <w:ilvl w:val="0"/>
+          <w:numId w:val="12"/>
+        </w:numPr>
         <w:jc w:val="both"/>
       </w:pPr>
       <w:r>
@@ -737,10 +768,12 @@
         <w:t>adicional noturno também sobre o período prorrogado após as 5h;</w:t>
       </w:r>
     </w:p>
-    <w:p/>
     <w:p>
       <w:pPr>
-        <w:ind w:firstLine="850"/>
+        <w:numPr>
+          <w:ilvl w:val="0"/>
+          <w:numId w:val="12"/>
+        </w:numPr>
         <w:jc w:val="both"/>
       </w:pPr>
       <w:r>
@@ -753,10 +786,12 @@
         <w:t>correta anotação da função na CTPS;</w:t>
       </w:r>
     </w:p>
-    <w:p/>
     <w:p>
       <w:pPr>
-        <w:ind w:firstLine="850"/>
+        <w:numPr>
+          <w:ilvl w:val="0"/>
+          <w:numId w:val="12"/>
+        </w:numPr>
         <w:jc w:val="both"/>
       </w:pPr>
       <w:r>
@@ -769,10 +804,12 @@
         <w:t>fornecimento do Perfil Profissiográfico Previdenciário;</w:t>
       </w:r>
     </w:p>
-    <w:p/>
     <w:p>
       <w:pPr>
-        <w:ind w:firstLine="850"/>
+        <w:numPr>
+          <w:ilvl w:val="0"/>
+          <w:numId w:val="12"/>
+        </w:numPr>
         <w:jc w:val="both"/>
       </w:pPr>
       <w:r>
@@ -900,7 +937,10 @@
     <w:p/>
     <w:p>
       <w:pPr>
-        <w:ind w:firstLine="850"/>
+        <w:numPr>
+          <w:ilvl w:val="0"/>
+          <w:numId w:val="13"/>
+        </w:numPr>
         <w:jc w:val="both"/>
       </w:pPr>
       <w:r>
@@ -913,10 +953,12 @@
         <w:t>precisava chegar aproximadamente dez minutos antes para iniciar a preparação da máquina;</w:t>
       </w:r>
     </w:p>
-    <w:p/>
     <w:p>
       <w:pPr>
-        <w:ind w:firstLine="850"/>
+        <w:numPr>
+          <w:ilvl w:val="0"/>
+          <w:numId w:val="13"/>
+        </w:numPr>
         <w:jc w:val="both"/>
       </w:pPr>
       <w:r>
@@ -929,10 +971,12 @@
         <w:t>trabalhava no intervalo para atender às necessidades da produção;</w:t>
       </w:r>
     </w:p>
-    <w:p/>
     <w:p>
       <w:pPr>
-        <w:ind w:firstLine="850"/>
+        <w:numPr>
+          <w:ilvl w:val="0"/>
+          <w:numId w:val="13"/>
+        </w:numPr>
         <w:jc w:val="both"/>
       </w:pPr>
       <w:r>
@@ -945,10 +989,12 @@
         <w:t>participava de períodos de “serão”, com antecipação e prorrogação do turno;</w:t>
       </w:r>
     </w:p>
-    <w:p/>
     <w:p>
       <w:pPr>
-        <w:ind w:firstLine="850"/>
+        <w:numPr>
+          <w:ilvl w:val="0"/>
+          <w:numId w:val="13"/>
+        </w:numPr>
         <w:jc w:val="both"/>
       </w:pPr>
       <w:r>
@@ -996,7 +1042,10 @@
     <w:p/>
     <w:p>
       <w:pPr>
-        <w:ind w:firstLine="850"/>
+        <w:numPr>
+          <w:ilvl w:val="0"/>
+          <w:numId w:val="14"/>
+        </w:numPr>
         <w:jc w:val="both"/>
       </w:pPr>
       <w:r>
@@ -1009,10 +1058,12 @@
         <w:t>todos os cartões de ponto oficiais;</w:t>
       </w:r>
     </w:p>
-    <w:p/>
     <w:p>
       <w:pPr>
-        <w:ind w:firstLine="850"/>
+        <w:numPr>
+          <w:ilvl w:val="0"/>
+          <w:numId w:val="14"/>
+        </w:numPr>
         <w:jc w:val="both"/>
       </w:pPr>
       <w:r>
@@ -1025,10 +1076,12 @@
         <w:t>arquivos e registros do controle digital paralelo;</w:t>
       </w:r>
     </w:p>
-    <w:p/>
     <w:p>
       <w:pPr>
-        <w:ind w:firstLine="850"/>
+        <w:numPr>
+          <w:ilvl w:val="0"/>
+          <w:numId w:val="14"/>
+        </w:numPr>
         <w:jc w:val="both"/>
       </w:pPr>
       <w:r>
@@ -1041,10 +1094,12 @@
         <w:t>logs de acesso, relatórios, espelhos e históricos de alterações;</w:t>
       </w:r>
     </w:p>
-    <w:p/>
     <w:p>
       <w:pPr>
-        <w:ind w:firstLine="850"/>
+        <w:numPr>
+          <w:ilvl w:val="0"/>
+          <w:numId w:val="14"/>
+        </w:numPr>
         <w:jc w:val="both"/>
       </w:pPr>
       <w:r>
@@ -1057,10 +1112,12 @@
         <w:t>escalas de trabalho e de domingos;</w:t>
       </w:r>
     </w:p>
-    <w:p/>
     <w:p>
       <w:pPr>
-        <w:ind w:firstLine="850"/>
+        <w:numPr>
+          <w:ilvl w:val="0"/>
+          <w:numId w:val="14"/>
+        </w:numPr>
         <w:jc w:val="both"/>
       </w:pPr>
       <w:r>
@@ -1073,10 +1130,12 @@
         <w:t>demonstrativos do banco de horas;</w:t>
       </w:r>
     </w:p>
-    <w:p/>
     <w:p>
       <w:pPr>
-        <w:ind w:firstLine="850"/>
+        <w:numPr>
+          <w:ilvl w:val="0"/>
+          <w:numId w:val="14"/>
+        </w:numPr>
         <w:jc w:val="both"/>
       </w:pPr>
       <w:r>
@@ -1089,10 +1148,12 @@
         <w:t>comprovantes dos pagamentos feitos em dinheiro;</w:t>
       </w:r>
     </w:p>
-    <w:p/>
     <w:p>
       <w:pPr>
-        <w:ind w:firstLine="850"/>
+        <w:numPr>
+          <w:ilvl w:val="0"/>
+          <w:numId w:val="14"/>
+        </w:numPr>
         <w:jc w:val="both"/>
       </w:pPr>
       <w:r>
@@ -1105,10 +1166,12 @@
         <w:t>recibos salariais;</w:t>
       </w:r>
     </w:p>
-    <w:p/>
     <w:p>
       <w:pPr>
-        <w:ind w:firstLine="850"/>
+        <w:numPr>
+          <w:ilvl w:val="0"/>
+          <w:numId w:val="14"/>
+        </w:numPr>
         <w:jc w:val="both"/>
       </w:pPr>
       <w:r>
@@ -1121,10 +1184,12 @@
         <w:t>fichas financeiras;</w:t>
       </w:r>
     </w:p>
-    <w:p/>
     <w:p>
       <w:pPr>
-        <w:ind w:firstLine="850"/>
+        <w:numPr>
+          <w:ilvl w:val="0"/>
+          <w:numId w:val="14"/>
+        </w:numPr>
         <w:jc w:val="both"/>
       </w:pPr>
       <w:r>
@@ -1137,10 +1202,12 @@
         <w:t>eventos do eSocial relacionados à remuneração e pagamentos;</w:t>
       </w:r>
     </w:p>
-    <w:p/>
     <w:p>
       <w:pPr>
-        <w:ind w:firstLine="850"/>
+        <w:numPr>
+          <w:ilvl w:val="0"/>
+          <w:numId w:val="14"/>
+        </w:numPr>
         <w:jc w:val="both"/>
       </w:pPr>
       <w:r>
@@ -1351,7 +1418,10 @@
     <w:p/>
     <w:p>
       <w:pPr>
-        <w:ind w:firstLine="850"/>
+        <w:numPr>
+          <w:ilvl w:val="0"/>
+          <w:numId w:val="15"/>
+        </w:numPr>
         <w:jc w:val="both"/>
       </w:pPr>
       <w:r>
@@ -1364,10 +1434,12 @@
         <w:t>os limites de oito horas diárias e 44 horas semanais;</w:t>
       </w:r>
     </w:p>
-    <w:p/>
     <w:p>
       <w:pPr>
-        <w:ind w:firstLine="850"/>
+        <w:numPr>
+          <w:ilvl w:val="0"/>
+          <w:numId w:val="15"/>
+        </w:numPr>
         <w:jc w:val="both"/>
       </w:pPr>
       <w:r>
@@ -1380,10 +1452,12 @@
         <w:t>o intervalo efetivamente usufruído;</w:t>
       </w:r>
     </w:p>
-    <w:p/>
     <w:p>
       <w:pPr>
-        <w:ind w:firstLine="850"/>
+        <w:numPr>
+          <w:ilvl w:val="0"/>
+          <w:numId w:val="15"/>
+        </w:numPr>
         <w:jc w:val="both"/>
       </w:pPr>
       <w:r>
@@ -1396,10 +1470,12 @@
         <w:t>a redução da hora noturna para 52 minutos e 30 segundos;</w:t>
       </w:r>
     </w:p>
-    <w:p/>
     <w:p>
       <w:pPr>
-        <w:ind w:firstLine="850"/>
+        <w:numPr>
+          <w:ilvl w:val="0"/>
+          <w:numId w:val="15"/>
+        </w:numPr>
         <w:jc w:val="both"/>
       </w:pPr>
       <w:r>
@@ -1412,10 +1488,12 @@
         <w:t>a antecipação e a prorrogação do turno;</w:t>
       </w:r>
     </w:p>
-    <w:p/>
     <w:p>
       <w:pPr>
-        <w:ind w:firstLine="850"/>
+        <w:numPr>
+          <w:ilvl w:val="0"/>
+          <w:numId w:val="15"/>
+        </w:numPr>
         <w:jc w:val="both"/>
       </w:pPr>
       <w:r>
@@ -1428,10 +1506,12 @@
         <w:t>a validade ou invalidade de eventual regime de compensação;</w:t>
       </w:r>
     </w:p>
-    <w:p/>
     <w:p>
       <w:pPr>
-        <w:ind w:firstLine="850"/>
+        <w:numPr>
+          <w:ilvl w:val="0"/>
+          <w:numId w:val="15"/>
+        </w:numPr>
         <w:jc w:val="both"/>
       </w:pPr>
       <w:r>
@@ -1495,7 +1575,10 @@
     <w:p/>
     <w:p>
       <w:pPr>
-        <w:ind w:firstLine="850"/>
+        <w:numPr>
+          <w:ilvl w:val="0"/>
+          <w:numId w:val="16"/>
+        </w:numPr>
         <w:jc w:val="both"/>
       </w:pPr>
       <w:r>
@@ -1508,10 +1591,12 @@
         <w:t>adicional normativo de 60%;</w:t>
       </w:r>
     </w:p>
-    <w:p/>
     <w:p>
       <w:pPr>
-        <w:ind w:firstLine="850"/>
+        <w:numPr>
+          <w:ilvl w:val="0"/>
+          <w:numId w:val="16"/>
+        </w:numPr>
         <w:jc w:val="both"/>
       </w:pPr>
       <w:r>
@@ -1524,10 +1609,12 @@
         <w:t>adicional de 100% nos domingos e feriados não compensados;</w:t>
       </w:r>
     </w:p>
-    <w:p/>
     <w:p>
       <w:pPr>
-        <w:ind w:firstLine="850"/>
+        <w:numPr>
+          <w:ilvl w:val="0"/>
+          <w:numId w:val="16"/>
+        </w:numPr>
         <w:jc w:val="both"/>
       </w:pPr>
       <w:r>
@@ -1540,10 +1627,12 @@
         <w:t>observância da hora noturna reduzida;</w:t>
       </w:r>
     </w:p>
-    <w:p/>
     <w:p>
       <w:pPr>
-        <w:ind w:firstLine="850"/>
+        <w:numPr>
+          <w:ilvl w:val="0"/>
+          <w:numId w:val="16"/>
+        </w:numPr>
         <w:jc w:val="both"/>
       </w:pPr>
       <w:r>
@@ -1556,10 +1645,12 @@
         <w:t>adicional noturno nas horas prestadas em período noturno e prorrogado;</w:t>
       </w:r>
     </w:p>
-    <w:p/>
     <w:p>
       <w:pPr>
-        <w:ind w:firstLine="850"/>
+        <w:numPr>
+          <w:ilvl w:val="0"/>
+          <w:numId w:val="16"/>
+        </w:numPr>
         <w:jc w:val="both"/>
       </w:pPr>
       <w:r>
@@ -1572,10 +1663,12 @@
         <w:t>inclusão do adicional de insalubridade pago habitualmente na base de cálculo;</w:t>
       </w:r>
     </w:p>
-    <w:p/>
     <w:p>
       <w:pPr>
-        <w:ind w:firstLine="850"/>
+        <w:numPr>
+          <w:ilvl w:val="0"/>
+          <w:numId w:val="16"/>
+        </w:numPr>
         <w:jc w:val="both"/>
       </w:pPr>
       <w:r>
@@ -1674,7 +1767,10 @@
     <w:p/>
     <w:p>
       <w:pPr>
-        <w:ind w:firstLine="850"/>
+        <w:numPr>
+          <w:ilvl w:val="0"/>
+          <w:numId w:val="17"/>
+        </w:numPr>
         <w:jc w:val="both"/>
       </w:pPr>
       <w:r>
@@ -1687,10 +1783,12 @@
         <w:t>limite de horas semanais;</w:t>
       </w:r>
     </w:p>
-    <w:p/>
     <w:p>
       <w:pPr>
-        <w:ind w:firstLine="850"/>
+        <w:numPr>
+          <w:ilvl w:val="0"/>
+          <w:numId w:val="17"/>
+        </w:numPr>
         <w:jc w:val="both"/>
       </w:pPr>
       <w:r>
@@ -1703,10 +1801,12 @@
         <w:t>contabilização dos créditos e débitos;</w:t>
       </w:r>
     </w:p>
-    <w:p/>
     <w:p>
       <w:pPr>
-        <w:ind w:firstLine="850"/>
+        <w:numPr>
+          <w:ilvl w:val="0"/>
+          <w:numId w:val="17"/>
+        </w:numPr>
         <w:jc w:val="both"/>
       </w:pPr>
       <w:r>
@@ -1719,10 +1819,12 @@
         <w:t>período anual de apuração;</w:t>
       </w:r>
     </w:p>
-    <w:p/>
     <w:p>
       <w:pPr>
-        <w:ind w:firstLine="850"/>
+        <w:numPr>
+          <w:ilvl w:val="0"/>
+          <w:numId w:val="17"/>
+        </w:numPr>
         <w:jc w:val="both"/>
       </w:pPr>
       <w:r>
@@ -1735,10 +1837,12 @@
         <w:t>pagamento do saldo positivo;</w:t>
       </w:r>
     </w:p>
-    <w:p/>
     <w:p>
       <w:pPr>
-        <w:ind w:firstLine="850"/>
+        <w:numPr>
+          <w:ilvl w:val="0"/>
+          <w:numId w:val="17"/>
+        </w:numPr>
         <w:jc w:val="both"/>
       </w:pPr>
       <w:r>
@@ -1751,10 +1855,12 @@
         <w:t>absorção do saldo negativo em determinadas situações;</w:t>
       </w:r>
     </w:p>
-    <w:p/>
     <w:p>
       <w:pPr>
-        <w:ind w:firstLine="850"/>
+        <w:numPr>
+          <w:ilvl w:val="0"/>
+          <w:numId w:val="17"/>
+        </w:numPr>
         <w:jc w:val="both"/>
       </w:pPr>
       <w:r>
@@ -1930,7 +2036,10 @@
     <w:p/>
     <w:p>
       <w:pPr>
-        <w:ind w:firstLine="850"/>
+        <w:numPr>
+          <w:ilvl w:val="0"/>
+          <w:numId w:val="18"/>
+        </w:numPr>
         <w:jc w:val="both"/>
       </w:pPr>
       <w:r>
@@ -1943,10 +2052,12 @@
         <w:t>quais domingos foram trabalhados;</w:t>
       </w:r>
     </w:p>
-    <w:p/>
     <w:p>
       <w:pPr>
-        <w:ind w:firstLine="850"/>
+        <w:numPr>
+          <w:ilvl w:val="0"/>
+          <w:numId w:val="18"/>
+        </w:numPr>
         <w:jc w:val="both"/>
       </w:pPr>
       <w:r>
@@ -1959,10 +2070,12 @@
         <w:t>se houve folga compensatória na semana anterior ou posterior;</w:t>
       </w:r>
     </w:p>
-    <w:p/>
     <w:p>
       <w:pPr>
-        <w:ind w:firstLine="850"/>
+        <w:numPr>
+          <w:ilvl w:val="0"/>
+          <w:numId w:val="18"/>
+        </w:numPr>
         <w:jc w:val="both"/>
       </w:pPr>
       <w:r>
@@ -1975,10 +2088,12 @@
         <w:t>a quantidade de horas efetivamente paga;</w:t>
       </w:r>
     </w:p>
-    <w:p/>
     <w:p>
       <w:pPr>
-        <w:ind w:firstLine="850"/>
+        <w:numPr>
+          <w:ilvl w:val="0"/>
+          <w:numId w:val="18"/>
+        </w:numPr>
         <w:jc w:val="both"/>
       </w:pPr>
       <w:r>
@@ -1991,10 +2106,12 @@
         <w:t>o valor da hora utilizado;</w:t>
       </w:r>
     </w:p>
-    <w:p/>
     <w:p>
       <w:pPr>
-        <w:ind w:firstLine="850"/>
+        <w:numPr>
+          <w:ilvl w:val="0"/>
+          <w:numId w:val="18"/>
+        </w:numPr>
         <w:jc w:val="both"/>
       </w:pPr>
       <w:r>
@@ -2007,10 +2124,12 @@
         <w:t>a aplicação do adicional de 100%;</w:t>
       </w:r>
     </w:p>
-    <w:p/>
     <w:p>
       <w:pPr>
-        <w:ind w:firstLine="850"/>
+        <w:numPr>
+          <w:ilvl w:val="0"/>
+          <w:numId w:val="18"/>
+        </w:numPr>
         <w:jc w:val="both"/>
       </w:pPr>
       <w:r>
@@ -2023,10 +2142,12 @@
         <w:t>o adicional noturno e a hora noturna reduzida;</w:t>
       </w:r>
     </w:p>
-    <w:p/>
     <w:p>
       <w:pPr>
-        <w:ind w:firstLine="850"/>
+        <w:numPr>
+          <w:ilvl w:val="0"/>
+          <w:numId w:val="18"/>
+        </w:numPr>
         <w:jc w:val="both"/>
       </w:pPr>
       <w:r>
@@ -2122,7 +2243,10 @@
     <w:p/>
     <w:p>
       <w:pPr>
-        <w:ind w:firstLine="850"/>
+        <w:numPr>
+          <w:ilvl w:val="0"/>
+          <w:numId w:val="19"/>
+        </w:numPr>
         <w:jc w:val="both"/>
       </w:pPr>
       <w:r>
@@ -2135,10 +2259,12 @@
         <w:t>adicional noturno mínimo de 20%;</w:t>
       </w:r>
     </w:p>
-    <w:p/>
     <w:p>
       <w:pPr>
-        <w:ind w:firstLine="850"/>
+        <w:numPr>
+          <w:ilvl w:val="0"/>
+          <w:numId w:val="19"/>
+        </w:numPr>
         <w:jc w:val="both"/>
       </w:pPr>
       <w:r>
@@ -2151,10 +2277,12 @@
         <w:t>cômputo da hora noturna como 52 minutos e 30 segundos;</w:t>
       </w:r>
     </w:p>
-    <w:p/>
     <w:p>
       <w:pPr>
-        <w:ind w:firstLine="850"/>
+        <w:numPr>
+          <w:ilvl w:val="0"/>
+          <w:numId w:val="19"/>
+        </w:numPr>
         <w:jc w:val="both"/>
       </w:pPr>
       <w:r>
@@ -2202,7 +2330,10 @@
     <w:p/>
     <w:p>
       <w:pPr>
-        <w:ind w:firstLine="850"/>
+        <w:numPr>
+          <w:ilvl w:val="0"/>
+          <w:numId w:val="20"/>
+        </w:numPr>
         <w:jc w:val="both"/>
       </w:pPr>
       <w:r>
@@ -2215,10 +2346,12 @@
         <w:t>os períodos registrados apenas no controle paralelo;</w:t>
       </w:r>
     </w:p>
-    <w:p/>
     <w:p>
       <w:pPr>
-        <w:ind w:firstLine="850"/>
+        <w:numPr>
+          <w:ilvl w:val="0"/>
+          <w:numId w:val="20"/>
+        </w:numPr>
         <w:jc w:val="both"/>
       </w:pPr>
       <w:r>
@@ -2231,10 +2364,12 @@
         <w:t>as horas extraordinárias noturnas;</w:t>
       </w:r>
     </w:p>
-    <w:p/>
     <w:p>
       <w:pPr>
-        <w:ind w:firstLine="850"/>
+        <w:numPr>
+          <w:ilvl w:val="0"/>
+          <w:numId w:val="20"/>
+        </w:numPr>
         <w:jc w:val="both"/>
       </w:pPr>
       <w:r>
@@ -2247,10 +2382,12 @@
         <w:t>o trabalho aos domingos pago fora da folha;</w:t>
       </w:r>
     </w:p>
-    <w:p/>
     <w:p>
       <w:pPr>
-        <w:ind w:firstLine="850"/>
+        <w:numPr>
+          <w:ilvl w:val="0"/>
+          <w:numId w:val="20"/>
+        </w:numPr>
         <w:jc w:val="both"/>
       </w:pPr>
       <w:r>
@@ -2263,10 +2400,12 @@
         <w:t>a prorrogação após as 5h;</w:t>
       </w:r>
     </w:p>
-    <w:p/>
     <w:p>
       <w:pPr>
-        <w:ind w:firstLine="850"/>
+        <w:numPr>
+          <w:ilvl w:val="0"/>
+          <w:numId w:val="20"/>
+        </w:numPr>
         <w:jc w:val="both"/>
       </w:pPr>
       <w:r>
@@ -2279,10 +2418,12 @@
         <w:t>os minutos anteriores ou posteriores inseridos no período noturno;</w:t>
       </w:r>
     </w:p>
-    <w:p/>
     <w:p>
       <w:pPr>
-        <w:ind w:firstLine="850"/>
+        <w:numPr>
+          <w:ilvl w:val="0"/>
+          <w:numId w:val="20"/>
+        </w:numPr>
         <w:jc w:val="both"/>
       </w:pPr>
       <w:r>
@@ -2691,7 +2832,10 @@
     <w:p/>
     <w:p>
       <w:pPr>
-        <w:ind w:firstLine="850"/>
+        <w:numPr>
+          <w:ilvl w:val="0"/>
+          <w:numId w:val="21"/>
+        </w:numPr>
         <w:jc w:val="both"/>
       </w:pPr>
       <w:r>
@@ -2704,10 +2848,12 @@
         <w:t>calor proveniente das máquinas e moldes;</w:t>
       </w:r>
     </w:p>
-    <w:p/>
     <w:p>
       <w:pPr>
-        <w:ind w:firstLine="850"/>
+        <w:numPr>
+          <w:ilvl w:val="0"/>
+          <w:numId w:val="21"/>
+        </w:numPr>
         <w:jc w:val="both"/>
       </w:pPr>
       <w:r>
@@ -2720,10 +2866,12 @@
         <w:t>desmoldantes;</w:t>
       </w:r>
     </w:p>
-    <w:p/>
     <w:p>
       <w:pPr>
-        <w:ind w:firstLine="850"/>
+        <w:numPr>
+          <w:ilvl w:val="0"/>
+          <w:numId w:val="21"/>
+        </w:numPr>
         <w:jc w:val="both"/>
       </w:pPr>
       <w:r>
@@ -2736,10 +2884,12 @@
         <w:t>óleos e graxas;</w:t>
       </w:r>
     </w:p>
-    <w:p/>
     <w:p>
       <w:pPr>
-        <w:ind w:firstLine="850"/>
+        <w:numPr>
+          <w:ilvl w:val="0"/>
+          <w:numId w:val="21"/>
+        </w:numPr>
         <w:jc w:val="both"/>
       </w:pPr>
       <w:r>
@@ -2752,10 +2902,12 @@
         <w:t>produtos desengraxantes;</w:t>
       </w:r>
     </w:p>
-    <w:p/>
     <w:p>
       <w:pPr>
-        <w:ind w:firstLine="850"/>
+        <w:numPr>
+          <w:ilvl w:val="0"/>
+          <w:numId w:val="21"/>
+        </w:numPr>
         <w:jc w:val="both"/>
       </w:pPr>
       <w:r>
@@ -2768,10 +2920,12 @@
         <w:t>resíduos industriais;</w:t>
       </w:r>
     </w:p>
-    <w:p/>
     <w:p>
       <w:pPr>
-        <w:ind w:firstLine="850"/>
+        <w:numPr>
+          <w:ilvl w:val="0"/>
+          <w:numId w:val="21"/>
+        </w:numPr>
         <w:jc w:val="both"/>
       </w:pPr>
       <w:r>
@@ -2784,10 +2938,12 @@
         <w:t>matrizes pesadas;</w:t>
       </w:r>
     </w:p>
-    <w:p/>
     <w:p>
       <w:pPr>
-        <w:ind w:firstLine="850"/>
+        <w:numPr>
+          <w:ilvl w:val="0"/>
+          <w:numId w:val="21"/>
+        </w:numPr>
         <w:jc w:val="both"/>
       </w:pPr>
       <w:r>
@@ -4135,7 +4291,10 @@
     <w:p/>
     <w:p>
       <w:pPr>
-        <w:ind w:firstLine="850"/>
+        <w:numPr>
+          <w:ilvl w:val="0"/>
+          <w:numId w:val="22"/>
+        </w:numPr>
         <w:jc w:val="both"/>
       </w:pPr>
       <w:r>
@@ -4148,10 +4307,12 @@
         <w:t>A notificação da Reclamada para apresentar defesa, sob pena de revelia e confissão;</w:t>
       </w:r>
     </w:p>
-    <w:p/>
     <w:p>
       <w:pPr>
-        <w:ind w:firstLine="850"/>
+        <w:numPr>
+          <w:ilvl w:val="0"/>
+          <w:numId w:val="22"/>
+        </w:numPr>
         <w:jc w:val="both"/>
       </w:pPr>
       <w:r>
@@ -4164,10 +4325,12 @@
         <w:t>A procedência dos pedidos;</w:t>
       </w:r>
     </w:p>
-    <w:p/>
     <w:p>
       <w:pPr>
-        <w:ind w:firstLine="850"/>
+        <w:numPr>
+          <w:ilvl w:val="0"/>
+          <w:numId w:val="22"/>
+        </w:numPr>
         <w:jc w:val="both"/>
       </w:pPr>
       <w:r>
@@ -4180,10 +4343,12 @@
         <w:t>A produção de prova documental, testemunhal, pericial, depoimento pessoal do representante da Reclamada e exibição dos documentos indicados;</w:t>
       </w:r>
     </w:p>
-    <w:p/>
     <w:p>
       <w:pPr>
-        <w:ind w:firstLine="850"/>
+        <w:numPr>
+          <w:ilvl w:val="0"/>
+          <w:numId w:val="22"/>
+        </w:numPr>
         <w:jc w:val="both"/>
       </w:pPr>
       <w:r>
@@ -4196,10 +4361,12 @@
         <w:t>A autorização para posterior apresentação de cálculos detalhados, após a juntada dos controles e recibos mantidos pela empregadora;</w:t>
       </w:r>
     </w:p>
-    <w:p/>
     <w:p>
       <w:pPr>
-        <w:ind w:firstLine="850"/>
+        <w:numPr>
+          <w:ilvl w:val="0"/>
+          <w:numId w:val="22"/>
+        </w:numPr>
         <w:jc w:val="both"/>
       </w:pPr>
       <w:r>
@@ -4552,6 +4719,198 @@
       </w:rPr>
     </w:lvl>
   </w:abstractNum>
+  <w:abstractNum w:abstractNumId="9">
+    <w:multiLevelType w:val="hybridMultilevel"/>
+    <w:lvl w:ilvl="0">
+      <w:start w:val="1"/>
+      <w:numFmt w:val="bullet"/>
+      <w:lvlText w:val=""/>
+      <w:lvlJc w:val="left"/>
+      <w:pPr>
+        <w:ind w:left="720" w:hanging="360"/>
+      </w:pPr>
+      <w:rPr>
+        <w:rFonts w:ascii="Symbol" w:hAnsi="Symbol" w:hint="default"/>
+      </w:rPr>
+    </w:lvl>
+  </w:abstractNum>
+  <w:abstractNum w:abstractNumId="10">
+    <w:multiLevelType w:val="hybridMultilevel"/>
+    <w:lvl w:ilvl="0">
+      <w:start w:val="1"/>
+      <w:numFmt w:val="bullet"/>
+      <w:lvlText w:val=""/>
+      <w:lvlJc w:val="left"/>
+      <w:pPr>
+        <w:ind w:left="720" w:hanging="360"/>
+      </w:pPr>
+      <w:rPr>
+        <w:rFonts w:ascii="Symbol" w:hAnsi="Symbol" w:hint="default"/>
+      </w:rPr>
+    </w:lvl>
+  </w:abstractNum>
+  <w:abstractNum w:abstractNumId="11">
+    <w:multiLevelType w:val="hybridMultilevel"/>
+    <w:lvl w:ilvl="0">
+      <w:start w:val="1"/>
+      <w:numFmt w:val="bullet"/>
+      <w:lvlText w:val=""/>
+      <w:lvlJc w:val="left"/>
+      <w:pPr>
+        <w:ind w:left="720" w:hanging="360"/>
+      </w:pPr>
+      <w:rPr>
+        <w:rFonts w:ascii="Symbol" w:hAnsi="Symbol" w:hint="default"/>
+      </w:rPr>
+    </w:lvl>
+  </w:abstractNum>
+  <w:abstractNum w:abstractNumId="12">
+    <w:multiLevelType w:val="hybridMultilevel"/>
+    <w:lvl w:ilvl="0">
+      <w:start w:val="1"/>
+      <w:numFmt w:val="bullet"/>
+      <w:lvlText w:val=""/>
+      <w:lvlJc w:val="left"/>
+      <w:pPr>
+        <w:ind w:left="720" w:hanging="360"/>
+      </w:pPr>
+      <w:rPr>
+        <w:rFonts w:ascii="Symbol" w:hAnsi="Symbol" w:hint="default"/>
+      </w:rPr>
+    </w:lvl>
+  </w:abstractNum>
+  <w:abstractNum w:abstractNumId="13">
+    <w:multiLevelType w:val="hybridMultilevel"/>
+    <w:lvl w:ilvl="0">
+      <w:start w:val="1"/>
+      <w:numFmt w:val="bullet"/>
+      <w:lvlText w:val=""/>
+      <w:lvlJc w:val="left"/>
+      <w:pPr>
+        <w:ind w:left="720" w:hanging="360"/>
+      </w:pPr>
+      <w:rPr>
+        <w:rFonts w:ascii="Symbol" w:hAnsi="Symbol" w:hint="default"/>
+      </w:rPr>
+    </w:lvl>
+  </w:abstractNum>
+  <w:abstractNum w:abstractNumId="14">
+    <w:multiLevelType w:val="hybridMultilevel"/>
+    <w:lvl w:ilvl="0">
+      <w:start w:val="1"/>
+      <w:numFmt w:val="bullet"/>
+      <w:lvlText w:val=""/>
+      <w:lvlJc w:val="left"/>
+      <w:pPr>
+        <w:ind w:left="720" w:hanging="360"/>
+      </w:pPr>
+      <w:rPr>
+        <w:rFonts w:ascii="Symbol" w:hAnsi="Symbol" w:hint="default"/>
+      </w:rPr>
+    </w:lvl>
+  </w:abstractNum>
+  <w:abstractNum w:abstractNumId="15">
+    <w:multiLevelType w:val="hybridMultilevel"/>
+    <w:lvl w:ilvl="0">
+      <w:start w:val="1"/>
+      <w:numFmt w:val="bullet"/>
+      <w:lvlText w:val=""/>
+      <w:lvlJc w:val="left"/>
+      <w:pPr>
+        <w:ind w:left="720" w:hanging="360"/>
+      </w:pPr>
+      <w:rPr>
+        <w:rFonts w:ascii="Symbol" w:hAnsi="Symbol" w:hint="default"/>
+      </w:rPr>
+    </w:lvl>
+  </w:abstractNum>
+  <w:abstractNum w:abstractNumId="16">
+    <w:multiLevelType w:val="hybridMultilevel"/>
+    <w:lvl w:ilvl="0">
+      <w:start w:val="1"/>
+      <w:numFmt w:val="bullet"/>
+      <w:lvlText w:val=""/>
+      <w:lvlJc w:val="left"/>
+      <w:pPr>
+        <w:ind w:left="720" w:hanging="360"/>
+      </w:pPr>
+      <w:rPr>
+        <w:rFonts w:ascii="Symbol" w:hAnsi="Symbol" w:hint="default"/>
+      </w:rPr>
+    </w:lvl>
+  </w:abstractNum>
+  <w:abstractNum w:abstractNumId="17">
+    <w:multiLevelType w:val="hybridMultilevel"/>
+    <w:lvl w:ilvl="0">
+      <w:start w:val="1"/>
+      <w:numFmt w:val="bullet"/>
+      <w:lvlText w:val=""/>
+      <w:lvlJc w:val="left"/>
+      <w:pPr>
+        <w:ind w:left="720" w:hanging="360"/>
+      </w:pPr>
+      <w:rPr>
+        <w:rFonts w:ascii="Symbol" w:hAnsi="Symbol" w:hint="default"/>
+      </w:rPr>
+    </w:lvl>
+  </w:abstractNum>
+  <w:abstractNum w:abstractNumId="18">
+    <w:multiLevelType w:val="hybridMultilevel"/>
+    <w:lvl w:ilvl="0">
+      <w:start w:val="1"/>
+      <w:numFmt w:val="bullet"/>
+      <w:lvlText w:val=""/>
+      <w:lvlJc w:val="left"/>
+      <w:pPr>
+        <w:ind w:left="720" w:hanging="360"/>
+      </w:pPr>
+      <w:rPr>
+        <w:rFonts w:ascii="Symbol" w:hAnsi="Symbol" w:hint="default"/>
+      </w:rPr>
+    </w:lvl>
+  </w:abstractNum>
+  <w:abstractNum w:abstractNumId="19">
+    <w:multiLevelType w:val="hybridMultilevel"/>
+    <w:lvl w:ilvl="0">
+      <w:start w:val="1"/>
+      <w:numFmt w:val="bullet"/>
+      <w:lvlText w:val=""/>
+      <w:lvlJc w:val="left"/>
+      <w:pPr>
+        <w:ind w:left="720" w:hanging="360"/>
+      </w:pPr>
+      <w:rPr>
+        <w:rFonts w:ascii="Symbol" w:hAnsi="Symbol" w:hint="default"/>
+      </w:rPr>
+    </w:lvl>
+  </w:abstractNum>
+  <w:abstractNum w:abstractNumId="20">
+    <w:multiLevelType w:val="hybridMultilevel"/>
+    <w:lvl w:ilvl="0">
+      <w:start w:val="1"/>
+      <w:numFmt w:val="bullet"/>
+      <w:lvlText w:val=""/>
+      <w:lvlJc w:val="left"/>
+      <w:pPr>
+        <w:ind w:left="720" w:hanging="360"/>
+      </w:pPr>
+      <w:rPr>
+        <w:rFonts w:ascii="Symbol" w:hAnsi="Symbol" w:hint="default"/>
+      </w:rPr>
+    </w:lvl>
+  </w:abstractNum>
+  <w:abstractNum w:abstractNumId="21">
+    <w:multiLevelType w:val="hybridMultilevel"/>
+    <w:lvl w:ilvl="0">
+      <w:start w:val="1"/>
+      <w:numFmt w:val="decimal"/>
+      <w:lvlText w:val="%1."/>
+      <w:lvlJc w:val="left"/>
+      <w:pPr>
+        <w:ind w:left="720" w:hanging="360"/>
+      </w:pPr>
+    </w:lvl>
+  </w:abstractNum>
   <w:num w:numId="1">
     <w:abstractNumId w:val="8"/>
   </w:num>
@@ -4578,6 +4937,45 @@
   </w:num>
   <w:num w:numId="9">
     <w:abstractNumId w:val="0"/>
+  </w:num>
+  <w:num w:numId="10">
+    <w:abstractNumId w:val="9"/>
+  </w:num>
+  <w:num w:numId="11">
+    <w:abstractNumId w:val="10"/>
+  </w:num>
+  <w:num w:numId="12">
+    <w:abstractNumId w:val="11"/>
+  </w:num>
+  <w:num w:numId="13">
+    <w:abstractNumId w:val="12"/>
+  </w:num>
+  <w:num w:numId="14">
+    <w:abstractNumId w:val="13"/>
+  </w:num>
+  <w:num w:numId="15">
+    <w:abstractNumId w:val="14"/>
+  </w:num>
+  <w:num w:numId="16">
+    <w:abstractNumId w:val="15"/>
+  </w:num>
+  <w:num w:numId="17">
+    <w:abstractNumId w:val="16"/>
+  </w:num>
+  <w:num w:numId="18">
+    <w:abstractNumId w:val="17"/>
+  </w:num>
+  <w:num w:numId="19">
+    <w:abstractNumId w:val="18"/>
+  </w:num>
+  <w:num w:numId="20">
+    <w:abstractNumId w:val="19"/>
+  </w:num>
+  <w:num w:numId="21">
+    <w:abstractNumId w:val="20"/>
+  </w:num>
+  <w:num w:numId="22">
+    <w:abstractNumId w:val="21"/>
   </w:num>
 </w:numbering>
 </file>

</xml_diff>